<commit_message>
Added user_need == 'change AK order' condition to child support rules content in modify_step in both yml and docx
</commit_message>
<xml_diff>
--- a/docassemble/AKA2JBranding/data/templates/modify_content.docx
+++ b/docassemble/AKA2JBranding/data/templates/modify_content.docx
@@ -307,7 +307,43 @@
         <w:rPr>
           <w:color w:val="FF0000"/>
         </w:rPr>
-        <w:t xml:space="preserve"> if  user_need == 'respond to motion in divorce' and type_of_response == 'modify' and type_of_modification['child support'] and not type_of_modification['custody'] %}</w:t>
+        <w:t xml:space="preserve"> if</w:t>
+      </w:r>
+      <w:r>
+        <w:rPr>
+          <w:color w:val="FF0000"/>
+        </w:rPr>
+        <w:t xml:space="preserve"> user_need == 'change AK order' or</w:t>
+      </w:r>
+      <w:r>
+        <w:rPr>
+          <w:color w:val="FF0000"/>
+        </w:rPr>
+        <w:t xml:space="preserve">  </w:t>
+      </w:r>
+      <w:r>
+        <w:rPr>
+          <w:color w:val="FF0000"/>
+        </w:rPr>
+        <w:t>(</w:t>
+      </w:r>
+      <w:r>
+        <w:rPr>
+          <w:color w:val="FFC000"/>
+        </w:rPr>
+        <w:t>user_need == 'respond to motion in divorce' and type_of_response == 'modify' and type_of_modification['child support'] and not type_of_modification['custody']</w:t>
+      </w:r>
+      <w:r>
+        <w:rPr>
+          <w:color w:val="FF0000"/>
+        </w:rPr>
+        <w:t xml:space="preserve">) </w:t>
+      </w:r>
+      <w:r>
+        <w:rPr>
+          <w:color w:val="FF0000"/>
+        </w:rPr>
+        <w:t>%}</w:t>
       </w:r>
     </w:p>
     <w:p>

</xml_diff>